<commit_message>
docs(handover): PO rulings D-01..D-12 applied — launch scope register + phased execution plan
- LAUNCH_SCOPE_REGISTER: definitive scope (verified / under remediation /
  approved-for-build / PO-ratified exclusions)
- PHASED_EXECUTION_PLAN: phase gates, dependencies (G-05 before new admin
  surfaces, vendor-auth sign-off before D-01 build, sandbox keys before D-05),
  effort sizing
- Registers/guide/checklist/dashboard regenerated: 'excluded or under
  implementation' replaces 'pending decision'
- Vendor tenancy confirmed: platform-global vendors, tenant-scoped bookings
  (preserved per PO direction)

Generated with [Devin](https://devin.ai)

Co-Authored-By: Devin <158243242+devin-ai-integration[bot]@users.noreply.github.com>
</commit_message>
<xml_diff>
--- a/afruheritage-platform/uat-package/AFRUHERITAGE_CUSTOMER_UAT_GUIDE.docx
+++ b/afruheritage-platform/uat-package/AFRUHERITAGE_CUSTOMER_UAT_GUIDE.docx
@@ -77,7 +77,7 @@
         <w:pStyle w:val="ListBullet"/>
       </w:pPr>
       <w:r>
-        <w:t>Some capabilities are awaiting a Product Owner launch decision — they are listed in the Pending-decision register at the back of this guide; do not test them.</w:t>
+        <w:t>Some capabilities are excluded from the initial launch or still being built — they are listed in the launch-exclusions register at the back of this guide; do not test them.</w:t>
       </w:r>
     </w:p>
     <w:p>
@@ -4611,12 +4611,12 @@
         <w:pStyle w:val="Heading1"/>
       </w:pPr>
       <w:r>
-        <w:t>Pending PO launch decision — do not test these</w:t>
-      </w:r>
-    </w:p>
-    <w:p>
-      <w:r>
-        <w:t>The capabilities below await a Product Owner launch decision and are not available today. Do not test them. Separately, known defects are listed in the Delivery Gaps &amp; Defects register — those SHOULD be reported.</w:t>
+        <w:t>Not in the initial launch — do not test these</w:t>
+      </w:r>
+    </w:p>
+    <w:p>
+      <w:r>
+        <w:t>The capabilities below are excluded from the initial launch or still under implementation. Do not test them. Known defects are in the Delivery Gaps &amp; Defects register — those SHOULD be reported.</w:t>
       </w:r>
     </w:p>
     <w:tbl>
@@ -4700,7 +4700,7 @@
           </w:tcPr>
           <w:p>
             <w:r>
-              <w:t>Pending PO decision (D-01)</w:t>
+              <w:t>Under implementation (D-01) — not yet deployed</w:t>
             </w:r>
           </w:p>
         </w:tc>
@@ -4710,7 +4710,133 @@
           </w:tcPr>
           <w:p>
             <w:r>
-              <w:t>The vendor backend lifecycle is already built; the vendor-facing pages are missing. Awaiting a Product Owner decision on marketplace launch scope. Do not test.</w:t>
+              <w:t>Approved for build: vendor registration, approval, marketplace bookings. Not yet usable — do not test.</w:t>
+            </w:r>
+          </w:p>
+        </w:tc>
+      </w:tr>
+      <w:tr>
+        <w:tc>
+          <w:tcPr>
+            <w:tcW w:type="dxa" w:w="2160"/>
+          </w:tcPr>
+          <w:p>
+            <w:r>
+              <w:t>Central Afruheritage platform support intake</w:t>
+            </w:r>
+          </w:p>
+        </w:tc>
+        <w:tc>
+          <w:tcPr>
+            <w:tcW w:type="dxa" w:w="2160"/>
+          </w:tcPr>
+          <w:p>
+            <w:r>
+              <w:t>/support on the main site</w:t>
+            </w:r>
+          </w:p>
+        </w:tc>
+        <w:tc>
+          <w:tcPr>
+            <w:tcW w:type="dxa" w:w="2160"/>
+          </w:tcPr>
+          <w:p>
+            <w:r>
+              <w:t>Under implementation (D-04)</w:t>
+            </w:r>
+          </w:p>
+        </w:tc>
+        <w:tc>
+          <w:tcPr>
+            <w:tcW w:type="dxa" w:w="2160"/>
+          </w:tcPr>
+          <w:p>
+            <w:r>
+              <w:t>A platform-level support channel is being built. Today, tickets are submitted on each company's portal page.</w:t>
+            </w:r>
+          </w:p>
+        </w:tc>
+      </w:tr>
+      <w:tr>
+        <w:tc>
+          <w:tcPr>
+            <w:tcW w:type="dxa" w:w="2160"/>
+          </w:tcPr>
+          <w:p>
+            <w:r>
+              <w:t>CRM activity history</w:t>
+            </w:r>
+          </w:p>
+        </w:tc>
+        <w:tc>
+          <w:tcPr>
+            <w:tcW w:type="dxa" w:w="2160"/>
+          </w:tcPr>
+          <w:p>
+            <w:r>
+              <w:t>CRM section — contacts and quotes available</w:t>
+            </w:r>
+          </w:p>
+        </w:tc>
+        <w:tc>
+          <w:tcPr>
+            <w:tcW w:type="dxa" w:w="2160"/>
+          </w:tcPr>
+          <w:p>
+            <w:r>
+              <w:t>Under implementation (D-08)</w:t>
+            </w:r>
+          </w:p>
+        </w:tc>
+        <w:tc>
+          <w:tcPr>
+            <w:tcW w:type="dxa" w:w="2160"/>
+          </w:tcPr>
+          <w:p>
+            <w:r>
+              <w:t>The activity interface is being added. Contacts and quotes already work.</w:t>
+            </w:r>
+          </w:p>
+        </w:tc>
+      </w:tr>
+      <w:tr>
+        <w:tc>
+          <w:tcPr>
+            <w:tcW w:type="dxa" w:w="2160"/>
+          </w:tcPr>
+          <w:p>
+            <w:r>
+              <w:t>Live payment collection</w:t>
+            </w:r>
+          </w:p>
+        </w:tc>
+        <w:tc>
+          <w:tcPr>
+            <w:tcW w:type="dxa" w:w="2160"/>
+          </w:tcPr>
+          <w:p>
+            <w:r>
+              <w:t>Billing</w:t>
+            </w:r>
+          </w:p>
+        </w:tc>
+        <w:tc>
+          <w:tcPr>
+            <w:tcW w:type="dxa" w:w="2160"/>
+          </w:tcPr>
+          <w:p>
+            <w:r>
+              <w:t>Pending sandbox certification (D-05)</w:t>
+            </w:r>
+          </w:p>
+        </w:tc>
+        <w:tc>
+          <w:tcPr>
+            <w:tcW w:type="dxa" w:w="2160"/>
+          </w:tcPr>
+          <w:p>
+            <w:r>
+              <w:t>Manual-renewal billing model — there are no automatic recurring charges. Plan/trial selection works; do not attempt real-money payments during UAT.</w:t>
             </w:r>
           </w:p>
         </w:tc>
@@ -4742,7 +4868,7 @@
           </w:tcPr>
           <w:p>
             <w:r>
-              <w:t>Pending PO decision (D-02)</w:t>
+              <w:t>Excluded from initial launch (D-02)</w:t>
             </w:r>
           </w:p>
         </w:tc>
@@ -4752,7 +4878,7 @@
           </w:tcPr>
           <w:p>
             <w:r>
-              <w:t>Drivers are managed records today and cannot sign in. Awaiting decision on whether managed records suffice for launch.</w:t>
+              <w:t>Drivers are managed records — creation and assignment work; drivers cannot sign in.</w:t>
             </w:r>
           </w:p>
         </w:tc>
@@ -4764,7 +4890,7 @@
           </w:tcPr>
           <w:p>
             <w:r>
-              <w:t>Warehouse operations module</w:t>
+              <w:t>Warehouse operations</w:t>
             </w:r>
           </w:p>
         </w:tc>
@@ -4784,7 +4910,7 @@
           </w:tcPr>
           <w:p>
             <w:r>
-              <w:t>Pending PO decision (D-06)</w:t>
+              <w:t>Excluded from offering (D-06)</w:t>
             </w:r>
           </w:p>
         </w:tc>
@@ -4794,7 +4920,7 @@
           </w:tcPr>
           <w:p>
             <w:r>
-              <w:t>No implementation exists. Awaiting decision: build it, or remove it from the offering.</w:t>
+              <w:t>Not part of the Afruheritage launch product.</w:t>
             </w:r>
           </w:p>
         </w:tc>
@@ -4826,7 +4952,7 @@
           </w:tcPr>
           <w:p>
             <w:r>
-              <w:t>Pending PO decision (D-07)</w:t>
+              <w:t>Excluded from initial launch (D-07)</w:t>
             </w:r>
           </w:p>
         </w:tc>
@@ -4836,91 +4962,7 @@
           </w:tcPr>
           <w:p>
             <w:r>
-              <w:t>Basic operational counts already work. Awaiting decision on whether basic counts suffice for launch.</w:t>
-            </w:r>
-          </w:p>
-        </w:tc>
-      </w:tr>
-      <w:tr>
-        <w:tc>
-          <w:tcPr>
-            <w:tcW w:type="dxa" w:w="2160"/>
-          </w:tcPr>
-          <w:p>
-            <w:r>
-              <w:t>CRM activity history</w:t>
-            </w:r>
-          </w:p>
-        </w:tc>
-        <w:tc>
-          <w:tcPr>
-            <w:tcW w:type="dxa" w:w="2160"/>
-          </w:tcPr>
-          <w:p>
-            <w:r>
-              <w:t>CRM section — contacts and quotes available</w:t>
-            </w:r>
-          </w:p>
-        </w:tc>
-        <w:tc>
-          <w:tcPr>
-            <w:tcW w:type="dxa" w:w="2160"/>
-          </w:tcPr>
-          <w:p>
-            <w:r>
-              <w:t>Pending PO decision (D-08)</w:t>
-            </w:r>
-          </w:p>
-        </w:tc>
-        <w:tc>
-          <w:tcPr>
-            <w:tcW w:type="dxa" w:w="2160"/>
-          </w:tcPr>
-          <w:p>
-            <w:r>
-              <w:t>Activity endpoints exist but have no UI. Awaiting decision on launch requirement.</w:t>
-            </w:r>
-          </w:p>
-        </w:tc>
-      </w:tr>
-      <w:tr>
-        <w:tc>
-          <w:tcPr>
-            <w:tcW w:type="dxa" w:w="2160"/>
-          </w:tcPr>
-          <w:p>
-            <w:r>
-              <w:t>Central support tickets on afruheritage.com</w:t>
-            </w:r>
-          </w:p>
-        </w:tc>
-        <w:tc>
-          <w:tcPr>
-            <w:tcW w:type="dxa" w:w="2160"/>
-          </w:tcPr>
-          <w:p>
-            <w:r>
-              <w:t>/support on the main site</w:t>
-            </w:r>
-          </w:p>
-        </w:tc>
-        <w:tc>
-          <w:tcPr>
-            <w:tcW w:type="dxa" w:w="2160"/>
-          </w:tcPr>
-          <w:p>
-            <w:r>
-              <w:t>Pending PO decision (D-04)</w:t>
-            </w:r>
-          </w:p>
-        </w:tc>
-        <w:tc>
-          <w:tcPr>
-            <w:tcW w:type="dxa" w:w="2160"/>
-          </w:tcPr>
-          <w:p>
-            <w:r>
-              <w:t>Tickets today are submitted on each company's portal. Awaiting decision on a platform-level intake channel.</w:t>
+              <w:t>Basic operational counts already work; advanced dashboards follow later.</w:t>
             </w:r>
           </w:p>
         </w:tc>
@@ -4952,7 +4994,7 @@
           </w:tcPr>
           <w:p>
             <w:r>
-              <w:t>Pending PO decision (D-09)</w:t>
+              <w:t>Excluded — publish-blocked (D-09)</w:t>
             </w:r>
           </w:p>
         </w:tc>
@@ -4962,7 +5004,49 @@
           </w:tcPr>
           <w:p>
             <w:r>
-              <w:t>Preview only — publish-blocked until tenant-configurable content is complete.</w:t>
+              <w:t>Preview only; cannot be published until tenant-configurable content is complete.</w:t>
+            </w:r>
+          </w:p>
+        </w:tc>
+      </w:tr>
+      <w:tr>
+        <w:tc>
+          <w:tcPr>
+            <w:tcW w:type="dxa" w:w="2160"/>
+          </w:tcPr>
+          <w:p>
+            <w:r>
+              <w:t>Custom domains</w:t>
+            </w:r>
+          </w:p>
+        </w:tc>
+        <w:tc>
+          <w:tcPr>
+            <w:tcW w:type="dxa" w:w="2160"/>
+          </w:tcPr>
+          <w:p>
+            <w:r>
+              <w:t>—</w:t>
+            </w:r>
+          </w:p>
+        </w:tc>
+        <w:tc>
+          <w:tcPr>
+            <w:tcW w:type="dxa" w:w="2160"/>
+          </w:tcPr>
+          <w:p>
+            <w:r>
+              <w:t>Excluded from initial launch (D-10)</w:t>
+            </w:r>
+          </w:p>
+        </w:tc>
+        <w:tc>
+          <w:tcPr>
+            <w:tcW w:type="dxa" w:w="2160"/>
+          </w:tcPr>
+          <w:p>
+            <w:r>
+              <w:t>Company portals run on yourname.afruheritage.com. Custom domains need separate DNS/certificate work.</w:t>
             </w:r>
           </w:p>
         </w:tc>
@@ -4994,7 +5078,7 @@
           </w:tcPr>
           <w:p>
             <w:r>
-              <w:t>Pending PO decision (D-11)</w:t>
+              <w:t>Excluded from initial launch (D-11)</w:t>
             </w:r>
           </w:p>
         </w:tc>
@@ -5004,49 +5088,7 @@
           </w:tcPr>
           <w:p>
             <w:r>
-              <w:t>On the roadmap — the web app works on mobile browsers today.</w:t>
-            </w:r>
-          </w:p>
-        </w:tc>
-      </w:tr>
-      <w:tr>
-        <w:tc>
-          <w:tcPr>
-            <w:tcW w:type="dxa" w:w="2160"/>
-          </w:tcPr>
-          <w:p>
-            <w:r>
-              <w:t>Payment collection (live billing charges)</w:t>
-            </w:r>
-          </w:p>
-        </w:tc>
-        <w:tc>
-          <w:tcPr>
-            <w:tcW w:type="dxa" w:w="2160"/>
-          </w:tcPr>
-          <w:p>
-            <w:r>
-              <w:t>Billing</w:t>
-            </w:r>
-          </w:p>
-        </w:tc>
-        <w:tc>
-          <w:tcPr>
-            <w:tcW w:type="dxa" w:w="2160"/>
-          </w:tcPr>
-          <w:p>
-            <w:r>
-              <w:t>Pending PO decision (D-05)</w:t>
-            </w:r>
-          </w:p>
-        </w:tc>
-        <w:tc>
-          <w:tcPr>
-            <w:tcW w:type="dxa" w:w="2160"/>
-          </w:tcPr>
-          <w:p>
-            <w:r>
-              <w:t>Paystack/Flutterwave integrations exist but are unverified end-to-end. Plan/trial selection works; do not attempt real-money payments during UAT.</w:t>
+              <w:t>The web app works on mobile browsers; native apps are on the roadmap.</w:t>
             </w:r>
           </w:p>
         </w:tc>

</xml_diff>